<commit_message>
Add final report and slides
</commit_message>
<xml_diff>
--- a/report/PhamNgocQuangHuy_final_cuoiky.docx
+++ b/report/PhamNgocQuangHuy_final_cuoiky.docx
@@ -57,7 +57,7 @@
       <w:r>
         <w:drawing>
           <wp:inline xmlns:a="http://schemas.openxmlformats.org/drawingml/2006/main" xmlns:pic="http://schemas.openxmlformats.org/drawingml/2006/picture">
-            <wp:extent cx="1152000" cy="1152000"/>
+            <wp:extent cx="1152000" cy="1448518"/>
             <wp:docPr id="1" name="Picture 1" descr="Image: image1.png"/>
             <wp:cNvGraphicFramePr>
               <a:graphicFrameLocks noChangeAspect="1"/>
@@ -66,7 +66,7 @@
               <a:graphicData uri="http://schemas.openxmlformats.org/drawingml/2006/picture">
                 <pic:pic>
                   <pic:nvPicPr>
-                    <pic:cNvPr id="0" name="ptit_logo.png"/>
+                    <pic:cNvPr id="0" name="ptit_logo_cropped.png"/>
                     <pic:cNvPicPr/>
                   </pic:nvPicPr>
                   <pic:blipFill>
@@ -78,7 +78,7 @@
                   <pic:spPr>
                     <a:xfrm>
                       <a:off x="0" y="0"/>
-                      <a:ext cx="1152000" cy="1152000"/>
+                      <a:ext cx="1152000" cy="1448518"/>
                     </a:xfrm>
                     <a:prstGeom prst="rect"/>
                   </pic:spPr>
@@ -453,7 +453,7 @@
       <w:r>
         <w:drawing>
           <wp:inline xmlns:a="http://schemas.openxmlformats.org/drawingml/2006/main" xmlns:pic="http://schemas.openxmlformats.org/drawingml/2006/picture">
-            <wp:extent cx="1152000" cy="1152000"/>
+            <wp:extent cx="1152000" cy="1448518"/>
             <wp:docPr id="2" name="Picture 2" descr="Image: image1.png"/>
             <wp:cNvGraphicFramePr>
               <a:graphicFrameLocks noChangeAspect="1"/>
@@ -462,7 +462,7 @@
               <a:graphicData uri="http://schemas.openxmlformats.org/drawingml/2006/picture">
                 <pic:pic>
                   <pic:nvPicPr>
-                    <pic:cNvPr id="0" name="ptit_logo.png"/>
+                    <pic:cNvPr id="0" name="ptit_logo_cropped.png"/>
                     <pic:cNvPicPr/>
                   </pic:nvPicPr>
                   <pic:blipFill>
@@ -474,7 +474,7 @@
                   <pic:spPr>
                     <a:xfrm>
                       <a:off x="0" y="0"/>
-                      <a:ext cx="1152000" cy="1152000"/>
+                      <a:ext cx="1152000" cy="1448518"/>
                     </a:xfrm>
                     <a:prstGeom prst="rect"/>
                   </pic:spPr>
@@ -953,7 +953,7 @@
           <w:rFonts w:ascii="Times New Roman" w:hAnsi="Times New Roman" w:eastAsia="Times New Roman"/>
           <w:sz w:val="26"/>
         </w:rPr>
-        <w:t>Chèn screenshot minh chứng thật cho dataset, feature generation, huấn luyện, model testing, deployment build và browser realtime; ghi rõ realtime hiện mới chứng minh runtime webcam, chưa kiểm thử với chai thật ngoài hiện trường.</w:t>
+        <w:t>Chèn screenshot minh chứng thật cho dataset, feature generation, huấn luyện, model testing, deployment build và browser realtime; screenshot realtime ngày 07/06/2026 cho thấy client WebAssembly đã chạy bằng webcam và nhận diện chai 500ml với score 0.98.</w:t>
       </w:r>
     </w:p>
     <w:p>
@@ -981,7 +981,7 @@
           <w:i w:val="0"/>
           <w:sz w:val="26"/>
         </w:rPr>
-        <w:t>5. Link repository bài nộp: https://github.com/&lt;username&gt;/&lt;repository&gt; (thay bằng link thật trước khi nộp).</w:t>
+        <w:t>5. Link repository bài nộp: https://github.com/huyhuyhuy1999/N23DCCI034-PhamNgocQuangHuy-MangCamBien-FOMO</w:t>
       </w:r>
     </w:p>
     <w:p>
@@ -1022,7 +1022,7 @@
           <w:i w:val="0"/>
           <w:sz w:val="26"/>
         </w:rPr>
-        <w:t>Trong phạm vi thực hiện, project Edge Impulse của đề tài đã upload dataset prototype 120 ảnh, generate features, huấn luyện FOMO, model testing, build deployment và chạy thử browser realtime trên Edge Impulse Studio. Các nội dung chưa có dữ liệu camera thật với chai nhựa ngoài hiện trường được đánh dấu rõ để bổ sung sau.</w:t>
+        <w:t>Trong phạm vi thực hiện, project Edge Impulse của đề tài đã upload dataset prototype 120 ảnh, generate features, huấn luyện FOMO, model testing, build deployment và chạy thử browser realtime trên Edge Impulse Studio. Dataset huấn luyện vẫn là prototype 120 ảnh; riêng phần realtime browser đã có minh chứng thử bằng webcam với chai 500ml thật, còn 1L và 1.5L cần bổ sung kiểm thử ngoài hiện trường nếu nghiệm thu sâu.</w:t>
       </w:r>
     </w:p>
     <w:p>
@@ -1220,7 +1220,7 @@
           <w:i w:val="0"/>
           <w:sz w:val="26"/>
         </w:rPr>
-        <w:t>Kết quả thực nghiệm trên dataset prototype đạt validation F1 score 86.5%, test accuracy 86.67% và test F1 non-background 0.92. Hướng phát triển tiếp theo là bổ sung bộ dữ liệu thực tế tại nhiều điều kiện ánh sáng, tích hợp camera edge node, kiểm thử realtime bằng WebAssembly/browser và mở rộng hệ thống sang nhiều loại bao bì tái chế khác.</w:t>
+        <w:t>Kết quả thực nghiệm trên dataset prototype đạt validation F1 score 86.5%, test accuracy 86.67% và test F1 non-background 0.92. Project cũng đã build WebAssembly và chạy realtime browser bằng webcam với một mẫu chai 500ml thật. Hướng phát triển tiếp theo là bổ sung bộ dữ liệu thực tế tại nhiều điều kiện ánh sáng, kiểm thử realtime đầy đủ với cả 500ml, 1L và 1.5L, tích hợp camera edge node và mở rộng hệ thống sang nhiều loại bao bì tái chế khác.</w:t>
       </w:r>
     </w:p>
     <w:p>
@@ -1252,20 +1252,6 @@
         <w:fldChar w:fldCharType="separate"/>
         <w:t>1</w:t>
         <w:fldChar w:fldCharType="end"/>
-      </w:r>
-    </w:p>
-    <w:p>
-      <w:pPr>
-        <w:ind w:firstLine="0"/>
-      </w:pPr>
-      <w:r>
-        <w:rPr>
-          <w:rFonts w:ascii="Times New Roman" w:hAnsi="Times New Roman" w:eastAsia="Times New Roman"/>
-          <w:b w:val="0"/>
-          <w:i/>
-          <w:sz w:val="22"/>
-        </w:rPr>
-        <w:t>Lưu ý: nếu mục lục chưa hiện số trang trong Word, chọn References &gt; Update Table &gt; Update entire table trước khi nộp.</w:t>
       </w:r>
     </w:p>
     <w:p>
@@ -6261,7 +6247,7 @@
           <w:i w:val="0"/>
           <w:sz w:val="26"/>
         </w:rPr>
-        <w:t>Sau khi mô hình đạt kết quả chấp nhận được, project được build trong mục Deployment của Edge Impulse và chạy thử bằng browser realtime client. Khi test realtime, webcam gửi từng frame cho runtime trình duyệt, mô hình chạy cục bộ và trả về trạng thái inferencing theo thời gian thực. Do lượt demo này không đặt chai nhựa thật trước webcam, screenshot realtime chỉ chứng minh runtime browser đã chạy, chưa phải minh chứng nhận diện chai ngoài hiện trường.</w:t>
+        <w:t>Sau khi mô hình đạt kết quả chấp nhận được, project được build trong mục Deployment của Edge Impulse và chạy thử bằng browser realtime client. Khi test realtime, webcam gửi từng frame cho runtime trình duyệt, mô hình chạy cục bộ và trả về trạng thái inferencing theo thời gian thực. Trong lượt demo ngày 07/06/2026, browser realtime chạy bằng WebAssembly và webcam, hiển thị nhãn 500ml (0.98) trên chai nhựa thật trong khung hình. Screenshot này chứng minh luồng deployment, launch in browser và inferencing realtime đã hoạt động; tuy vậy đây là demo một mẫu 500ml, chưa phải đánh giá đầy đủ cho tất cả class ngoài hiện trường.</w:t>
       </w:r>
     </w:p>
     <w:p>
@@ -6330,7 +6316,7 @@
           <w:i/>
           <w:sz w:val="22"/>
         </w:rPr>
-        <w:t>Build deployment thật đã hoàn tất với phiên bản v12 (C++ library), thời điểm 21:40:07 ngày 05/06/2026. Trang deployment cũng hiển thị Launch in browser để chạy prototype realtime.</w:t>
+        <w:t>Build deployment thật đã hoàn tất với phiên bản v12 (C++ library), thời điểm 21:40:07 ngày 05/06/2026. Trang deployment cũng hiển thị Launch in browser để chạy prototype realtime ngay trên trình duyệt.</w:t>
       </w:r>
     </w:p>
     <w:p>
@@ -6341,7 +6327,7 @@
       <w:r>
         <w:drawing>
           <wp:inline xmlns:a="http://schemas.openxmlformats.org/drawingml/2006/main" xmlns:pic="http://schemas.openxmlformats.org/drawingml/2006/picture">
-            <wp:extent cx="5580000" cy="2458688"/>
+            <wp:extent cx="5580000" cy="2494554"/>
             <wp:docPr id="14" name="Picture 14" descr="Image: image12.png"/>
             <wp:cNvGraphicFramePr>
               <a:graphicFrameLocks noChangeAspect="1"/>
@@ -6362,7 +6348,7 @@
                   <pic:spPr>
                     <a:xfrm>
                       <a:off x="0" y="0"/>
-                      <a:ext cx="5580000" cy="2458688"/>
+                      <a:ext cx="5580000" cy="2494554"/>
                     </a:xfrm>
                     <a:prstGeom prst="rect"/>
                   </pic:spPr>
@@ -6399,7 +6385,7 @@
           <w:i/>
           <w:sz w:val="22"/>
         </w:rPr>
-        <w:t>Browser realtime client đã tải model và chuyển sang trạng thái Inferencing với webcam. Vùng camera trong ảnh được làm mờ để bảo vệ riêng tư; do không có chai nhựa trong khung hình, báo cáo không ghi nhận nhãn phát hiện giả.</w:t>
+        <w:t>Browser realtime client đã tải model và chuyển sang trạng thái Inferencing với webcam. Screenshot cho thấy chai 500ml thật được nhận diện với score 0.98, nhãn hiển thị trực tiếp trên khung hình và centroid nằm gần vùng nắp chai.</w:t>
       </w:r>
     </w:p>
     <w:p>
@@ -6595,7 +6581,7 @@
           <w:i w:val="0"/>
           <w:sz w:val="26"/>
         </w:rPr>
-        <w:t>Dataset thực nghiệm trong lượt triển khai này là dataset prototype được sinh tự động để có nhãn và bounding box nhất quán, không phải ảnh thu thập ngoài hiện trường. Mục tiêu của bước này là chạy thật pipeline Edge Impulse từ upload dữ liệu, generate features, train FOMO đến Model testing, đồng thời không bịa số liệu khi chưa có dữ liệu camera thực tế.</w:t>
+        <w:t>Dataset thực nghiệm trong lượt triển khai này là dataset prototype được sinh tự động để có nhãn và bounding box nhất quán, không phải ảnh thu thập ngoài hiện trường. Mục tiêu của bước này là chạy thật pipeline Edge Impulse từ upload dữ liệu, generate features, train FOMO đến Model testing. Riêng screenshot realtime browser sử dụng frame webcam thực tế với chai 500ml để minh chứng deployment đã chạy được trong trình duyệt.</w:t>
       </w:r>
     </w:p>
     <w:p>
@@ -8507,7 +8493,7 @@
                 <w:rFonts w:ascii="Times New Roman" w:hAnsi="Times New Roman" w:eastAsia="Times New Roman"/>
                 <w:sz w:val="23"/>
               </w:rPr>
-              <w:t>Browser client đã chạy Inferencing; camera frame được làm mờ để bảo vệ riêng tư</w:t>
+              <w:t>Browser client đã chạy Inferencing và nhận diện chai 500ml thật với score 0.98</w:t>
             </w:r>
           </w:p>
         </w:tc>
@@ -8838,7 +8824,7 @@
           <w:i w:val="0"/>
           <w:sz w:val="26"/>
         </w:rPr>
-        <w:t>Báo cáo cũng đưa ra pipeline triển khai rõ ràng: tạo project Edge Impulse của đề tài, upload dataset prototype, gán nhãn bounding box, thiết kế impulse, generate features, huấn luyện FOMO, đánh giá bằng metric thật, build deployment và chạy browser realtime. Phần cần bổ sung trong tương lai là kiểm thử với chai nhựa thật ngoài hiện trường, không phải chỉ runtime webcam.</w:t>
+        <w:t>Báo cáo cũng đưa ra pipeline triển khai rõ ràng: tạo project Edge Impulse của đề tài, upload dataset prototype, gán nhãn bounding box, thiết kế impulse, generate features, huấn luyện FOMO, đánh giá bằng metric thật, build deployment và chạy browser realtime nhận diện một chai 500ml thật. Phần cần bổ sung trong tương lai là kiểm thử đầy đủ với nhiều mẫu chai 500ml, 1L và 1.5L ngoài hiện trường.</w:t>
       </w:r>
     </w:p>
     <w:p>
@@ -9424,7 +9410,7 @@
                 <w:rFonts w:ascii="Times New Roman" w:hAnsi="Times New Roman" w:eastAsia="Times New Roman"/>
                 <w:sz w:val="23"/>
               </w:rPr>
-              <w:t>Build v12 C++ library và browser client đã chạy Inferencing</w:t>
+              <w:t>Build v12 C++ library và browser client đã nhận diện chai 500ml thật với score 0.98</w:t>
             </w:r>
           </w:p>
         </w:tc>
@@ -9979,7 +9965,7 @@
           <w:rFonts w:ascii="Times New Roman" w:hAnsi="Times New Roman" w:eastAsia="Times New Roman"/>
           <w:sz w:val="26"/>
         </w:rPr>
-        <w:t>Đã có ảnh deployment build thành công và browser realtime client đang Inferencing.</w:t>
+        <w:t>Đã có ảnh deployment build thành công và browser realtime client đang Inferencing với chai 500ml thật.</w:t>
       </w:r>
     </w:p>
     <w:p>
@@ -9991,7 +9977,7 @@
           <w:rFonts w:ascii="Times New Roman" w:hAnsi="Times New Roman" w:eastAsia="Times New Roman"/>
           <w:sz w:val="26"/>
         </w:rPr>
-        <w:t>Nên bổ sung thêm ảnh demo với chai thật trước camera nếu giảng viên yêu cầu nghiệm thu ngoài hiện trường.</w:t>
+        <w:t>Nên bổ sung thêm ảnh demo với chai 1L và 1.5L trước camera nếu giảng viên yêu cầu nghiệm thu đủ ba nhãn ngoài hiện trường.</w:t>
       </w:r>
     </w:p>
     <w:sectPr>

</xml_diff>